<commit_message>
Add footer recommendations to page review
Co-Authored-By: Claude Opus 5.5 <noreply@anthropic.com>
Claude-Session: https://claude.ai/code/session_01LSyrvd7LaRxkKmU1rjdcAC
</commit_message>
<xml_diff>
--- a/Langton_Cars_Airport_Transfers_Page_Review.docx
+++ b/Langton_Cars_Airport_Transfers_Page_Review.docx
@@ -21,7 +21,7 @@
         </w:rPr>
         <w:t xml:space="preserve">Page I checked: </w:t>
       </w:r>
-      <w:hyperlink w:history="1" r:id="rId7-3hzynjfaj3ohlz3yppp">
+      <w:hyperlink w:history="1" r:id="rIdjeid7nyljz8ooiiw3jlfv">
         <w:r>
           <w:rPr>
             <w:rStyle w:val="Hyperlink"/>
@@ -842,19 +842,6 @@
     </w:p>
     <w:p>
       <w:pPr>
-        <w:pStyle w:val="ListParagraph"/>
-        <w:numPr>
-          <w:ilvl w:val="0"/>
-          <w:numId w:val="2"/>
-        </w:numPr>
-        <w:spacing w:after="80"/>
-      </w:pPr>
-      <w:r>
-        <w:t xml:space="preserve">There is no privacy policy link in the footer. With a quote form collecting personal data, this should be added.</w:t>
-      </w:r>
-    </w:p>
-    <w:p>
-      <w:pPr>
         <w:pStyle w:val="Heading1"/>
         <w:spacing w:after="120" w:before="280"/>
       </w:pPr>
@@ -941,52 +928,236 @@
         <w:spacing w:after="120" w:before="280"/>
       </w:pPr>
       <w:r>
-        <w:t xml:space="preserve">9. Technical bits</w:t>
-      </w:r>
-    </w:p>
-    <w:p>
-      <w:pPr>
-        <w:pStyle w:val="ListParagraph"/>
-        <w:numPr>
-          <w:ilvl w:val="0"/>
-          <w:numId w:val="2"/>
-        </w:numPr>
-        <w:spacing w:after="80"/>
-      </w:pPr>
-      <w:r>
-        <w:t xml:space="preserve">The page language is set to "en" and the social sharing locale is en_US. For a UK business I would set both to en GB.</w:t>
-      </w:r>
-    </w:p>
-    <w:p>
-      <w:pPr>
-        <w:pStyle w:val="ListParagraph"/>
-        <w:numPr>
-          <w:ilvl w:val="0"/>
-          <w:numId w:val="2"/>
-        </w:numPr>
-        <w:spacing w:after="80"/>
-      </w:pPr>
-      <w:r>
-        <w:t xml:space="preserve">Comments are switched on for this page (the code loads a comment form). On a service page I would turn comments off.</w:t>
-      </w:r>
-    </w:p>
-    <w:p>
-      <w:pPr>
-        <w:pStyle w:val="ListParagraph"/>
-        <w:numPr>
-          <w:ilvl w:val="0"/>
-          <w:numId w:val="2"/>
-        </w:numPr>
-        <w:spacing w:after="80"/>
-      </w:pPr>
-      <w:r>
-        <w:t xml:space="preserve">During my check, the server returned a 403 error once for an iPhone browser and then started blocking my requests with "429 Too Many Requests" after only a handful of page loads. Please ask the host to review the firewall or rate limit settings so real visitors and Googlebot never get blocked. I could not open the robots.txt and sitemap because of this, so those are worth checking in Search Console.</w:t>
+        <w:t xml:space="preserve">9. Footer</w:t>
+      </w:r>
+    </w:p>
+    <w:p>
+      <w:pPr>
+        <w:spacing w:after="120"/>
+      </w:pPr>
+      <w:r>
+        <w:t xml:space="preserve">The footer has the basics, phone, email, address and WhatsApp, but it is doing very little for the customer or for SEO. It also feels a bit empty with a lot of dark space.</w:t>
+      </w:r>
+    </w:p>
+    <w:p>
+      <w:pPr>
+        <w:spacing w:after="60" w:before="120"/>
+        <w:jc w:val="center"/>
+      </w:pPr>
+      <w:r>
+        <w:drawing>
+          <wp:inline distT="0" distB="0" distL="0" distR="0">
+            <wp:extent cx="5715000" cy="1771650"/>
+            <wp:effectExtent t="0" r="0" b="0" l="0"/>
+            <wp:docPr id="1" name="Current footer" descr="Current footer" title="Current footer"/>
+            <wp:cNvGraphicFramePr>
+              <a:graphicFrameLocks xmlns:a="http://schemas.openxmlformats.org/drawingml/2006/main" noChangeAspect="1"/>
+            </wp:cNvGraphicFramePr>
+            <a:graphic xmlns:a="http://schemas.openxmlformats.org/drawingml/2006/main">
+              <a:graphicData uri="http://schemas.openxmlformats.org/drawingml/2006/picture">
+                <pic:pic xmlns:pic="http://schemas.openxmlformats.org/drawingml/2006/picture">
+                  <pic:nvPicPr>
+                    <pic:cNvPr id="0" name="" descr=""/>
+                    <pic:cNvPicPr>
+                      <a:picLocks noChangeAspect="1" noChangeArrowheads="1"/>
+                    </pic:cNvPicPr>
+                  </pic:nvPicPr>
+                  <pic:blipFill>
+                    <a:blip r:embed="rId12" cstate="none"/>
+                    <a:srcRect/>
+                    <a:stretch>
+                      <a:fillRect/>
+                    </a:stretch>
+                  </pic:blipFill>
+                  <pic:spPr bwMode="auto">
+                    <a:xfrm>
+                      <a:off x="0" y="0"/>
+                      <a:ext cx="5715000" cy="1771650"/>
+                    </a:xfrm>
+                    <a:prstGeom prst="rect">
+                      <a:avLst/>
+                    </a:prstGeom>
+                  </pic:spPr>
+                </pic:pic>
+              </a:graphicData>
+            </a:graphic>
+          </wp:inline>
+        </w:drawing>
+      </w:r>
+    </w:p>
+    <w:p>
+      <w:pPr>
+        <w:spacing w:after="200"/>
+        <w:jc w:val="center"/>
+      </w:pPr>
+      <w:r>
+        <w:rPr>
+          <w:i/>
+          <w:iCs/>
+          <w:color w:val="666666"/>
+          <w:sz w:val="18"/>
+          <w:szCs w:val="18"/>
+        </w:rPr>
+        <w:t xml:space="preserve">Current footer</w:t>
+      </w:r>
+    </w:p>
+    <w:p>
+      <w:pPr>
+        <w:pStyle w:val="ListParagraph"/>
+        <w:numPr>
+          <w:ilvl w:val="0"/>
+          <w:numId w:val="2"/>
+        </w:numPr>
+        <w:spacing w:after="80"/>
+      </w:pPr>
+      <w:r>
+        <w:t xml:space="preserve">Add a quick links column with Home, Airport Transfers, FAQ, Contact Us and Get a Quote. Once the airport pages are live, add Gatwick, Heathrow, Stansted and London City links here too. This spreads internal links across the whole site.</w:t>
+      </w:r>
+    </w:p>
+    <w:p>
+      <w:pPr>
+        <w:pStyle w:val="ListParagraph"/>
+        <w:numPr>
+          <w:ilvl w:val="0"/>
+          <w:numId w:val="2"/>
+        </w:numPr>
+        <w:spacing w:after="80"/>
+      </w:pPr>
+      <w:r>
+        <w:t xml:space="preserve">Add a Privacy Policy link. The site collects personal details through the quote form, so this is needed for UK GDPR, and a Terms or Booking Conditions page is good to have as well.</w:t>
+      </w:r>
+    </w:p>
+    <w:p>
+      <w:pPr>
+        <w:pStyle w:val="ListParagraph"/>
+        <w:numPr>
+          <w:ilvl w:val="0"/>
+          <w:numId w:val="2"/>
+        </w:numPr>
+        <w:spacing w:after="80"/>
+      </w:pPr>
+      <w:r>
+        <w:t xml:space="preserve">Show opening or booking hours, for example "Available 24 hours, pre booking required". People booking early flights want to see this.</w:t>
+      </w:r>
+    </w:p>
+    <w:p>
+      <w:pPr>
+        <w:pStyle w:val="ListParagraph"/>
+        <w:numPr>
+          <w:ilvl w:val="0"/>
+          <w:numId w:val="2"/>
+        </w:numPr>
+        <w:spacing w:after="80"/>
+      </w:pPr>
+      <w:r>
+        <w:t xml:space="preserve">Link the address to Google Maps and use the exact same name, address and phone as the Google Business Profile. A small Google reviews badge or star rating here would add a lot of trust.</w:t>
+      </w:r>
+    </w:p>
+    <w:p>
+      <w:pPr>
+        <w:pStyle w:val="ListParagraph"/>
+        <w:numPr>
+          <w:ilvl w:val="0"/>
+          <w:numId w:val="2"/>
+        </w:numPr>
+        <w:spacing w:after="80"/>
+      </w:pPr>
+      <w:r>
+        <w:t xml:space="preserve">Add the private hire licence details from the council. It reassures customers and almost every competitor shows it.</w:t>
+      </w:r>
+    </w:p>
+    <w:p>
+      <w:pPr>
+        <w:pStyle w:val="ListParagraph"/>
+        <w:numPr>
+          <w:ilvl w:val="0"/>
+          <w:numId w:val="2"/>
+        </w:numPr>
+        <w:spacing w:after="80"/>
+      </w:pPr>
+      <w:r>
+        <w:t xml:space="preserve">The WhatsApp block says "Chat on WhatsApp" and then the button just says "WHATSAPP". I would merge it into one clear button like "Message us on WhatsApp" with the WhatsApp icon, and place it next to a "Call now" button.</w:t>
+      </w:r>
+    </w:p>
+    <w:p>
+      <w:pPr>
+        <w:pStyle w:val="ListParagraph"/>
+        <w:numPr>
+          <w:ilvl w:val="0"/>
+          <w:numId w:val="2"/>
+        </w:numPr>
+        <w:spacing w:after="80"/>
+      </w:pPr>
+      <w:r>
+        <w:t xml:space="preserve">Switch the Gmail address to a domain email like bookings@langtoncars.com.</w:t>
+      </w:r>
+    </w:p>
+    <w:p>
+      <w:pPr>
+        <w:pStyle w:val="ListParagraph"/>
+        <w:numPr>
+          <w:ilvl w:val="0"/>
+          <w:numId w:val="2"/>
+        </w:numPr>
+        <w:spacing w:after="80"/>
+      </w:pPr>
+      <w:r>
+        <w:t xml:space="preserve">In the code the heading is typed as "CONTACt Us". It shows fine on screen because of the capitals style, but worth correcting.</w:t>
       </w:r>
     </w:p>
     <w:p>
       <w:pPr>
         <w:pStyle w:val="Heading1"/>
         <w:spacing w:after="120" w:before="280"/>
+      </w:pPr>
+      <w:r>
+        <w:t xml:space="preserve">10. Technical bits</w:t>
+      </w:r>
+    </w:p>
+    <w:p>
+      <w:pPr>
+        <w:pStyle w:val="ListParagraph"/>
+        <w:numPr>
+          <w:ilvl w:val="0"/>
+          <w:numId w:val="2"/>
+        </w:numPr>
+        <w:spacing w:after="80"/>
+      </w:pPr>
+      <w:r>
+        <w:t xml:space="preserve">The page language is set to "en" and the social sharing locale is en_US. For a UK business I would set both to en GB.</w:t>
+      </w:r>
+    </w:p>
+    <w:p>
+      <w:pPr>
+        <w:pStyle w:val="ListParagraph"/>
+        <w:numPr>
+          <w:ilvl w:val="0"/>
+          <w:numId w:val="2"/>
+        </w:numPr>
+        <w:spacing w:after="80"/>
+      </w:pPr>
+      <w:r>
+        <w:t xml:space="preserve">Comments are switched on for this page (the code loads a comment form). On a service page I would turn comments off.</w:t>
+      </w:r>
+    </w:p>
+    <w:p>
+      <w:pPr>
+        <w:pStyle w:val="ListParagraph"/>
+        <w:numPr>
+          <w:ilvl w:val="0"/>
+          <w:numId w:val="2"/>
+        </w:numPr>
+        <w:spacing w:after="80"/>
+      </w:pPr>
+      <w:r>
+        <w:t xml:space="preserve">During my check, the server returned a 403 error once for an iPhone browser and then started blocking my requests with "429 Too Many Requests" after only a handful of page loads. Please ask the host to review the firewall or rate limit settings so real visitors and Googlebot never get blocked. I could not open the robots.txt and sitemap because of this, so those are worth checking in Search Console.</w:t>
+      </w:r>
+    </w:p>
+    <w:p>
+      <w:pPr>
+        <w:pStyle w:val="Heading1"/>
+        <w:pageBreakBefore/>
+        <w:spacing w:after="120"/>
       </w:pPr>
       <w:r>
         <w:t xml:space="preserve">Priority list</w:t>
@@ -1445,6 +1616,52 @@
                 <w:sz w:val="20"/>
                 <w:szCs w:val="20"/>
               </w:rPr>
+              <w:t xml:space="preserve">Medium</w:t>
+            </w:r>
+          </w:p>
+        </w:tc>
+        <w:tc>
+          <w:tcPr>
+            <w:tcW w:type="dxa" w:w="7426"/>
+            <w:tcMar>
+              <w:top w:type="dxa" w:w="80"/>
+              <w:left w:type="dxa" w:w="120"/>
+              <w:bottom w:type="dxa" w:w="80"/>
+              <w:right w:type="dxa" w:w="120"/>
+            </w:tcMar>
+          </w:tcPr>
+          <w:p>
+            <w:r>
+              <w:rPr>
+                <w:b w:val="false"/>
+                <w:bCs w:val="false"/>
+                <w:sz w:val="20"/>
+                <w:szCs w:val="20"/>
+              </w:rPr>
+              <w:t xml:space="preserve">Rebuild the footer with quick links, privacy policy, hours and licence details</w:t>
+            </w:r>
+          </w:p>
+        </w:tc>
+      </w:tr>
+      <w:tr>
+        <w:tc>
+          <w:tcPr>
+            <w:tcW w:type="dxa" w:w="1600"/>
+            <w:tcMar>
+              <w:top w:type="dxa" w:w="80"/>
+              <w:left w:type="dxa" w:w="120"/>
+              <w:bottom w:type="dxa" w:w="80"/>
+              <w:right w:type="dxa" w:w="120"/>
+            </w:tcMar>
+          </w:tcPr>
+          <w:p>
+            <w:r>
+              <w:rPr>
+                <w:b w:val="false"/>
+                <w:bCs w:val="false"/>
+                <w:sz w:val="20"/>
+                <w:szCs w:val="20"/>
+              </w:rPr>
               <w:t xml:space="preserve">Low</w:t>
             </w:r>
           </w:p>

</xml_diff>